<commit_message>
try dataset from kaggle
</commit_message>
<xml_diff>
--- a/Assignment/Final Project/ML68_Assignment_preparation.docx
+++ b/Assignment/Final Project/ML68_Assignment_preparation.docx
@@ -1266,6 +1266,20 @@
     </w:p>
     <w:p>
       <w:pPr>
+        <w:pStyle w:val="ListParagraph"/>
+        <w:numPr>
+          <w:ilvl w:val="0"/>
+          <w:numId w:val="9"/>
+        </w:numPr>
+        <w:rPr>
+          <w:rFonts w:ascii="TH Sarabun New" w:hAnsi="TH Sarabun New" w:cs="TH Sarabun New"/>
+          <w:sz w:val="20"/>
+          <w:szCs w:val="24"/>
+        </w:rPr>
+      </w:pPr>
+    </w:p>
+    <w:p>
+      <w:pPr>
         <w:rPr>
           <w:rFonts w:ascii="TH Sarabun New" w:hAnsi="TH Sarabun New" w:cs="TH Sarabun New"/>
         </w:rPr>
@@ -1340,8 +1354,9 @@
       <w:pPr>
         <w:jc w:val="center"/>
         <w:rPr>
-          <w:rFonts w:ascii="TH Sarabun New" w:hAnsi="TH Sarabun New" w:cs="TH Sarabun New"/>
-          <w:szCs w:val="24"/>
+          <w:rFonts w:ascii="TH Sarabun New" w:hAnsi="TH Sarabun New" w:cs="TH Sarabun New" w:hint="cs"/>
+          <w:szCs w:val="24"/>
+          <w:cs/>
         </w:rPr>
       </w:pPr>
       <w:r>
@@ -1354,10 +1369,11 @@
       </w:r>
       <w:r>
         <w:rPr>
-          <w:rFonts w:ascii="TH Sarabun New" w:hAnsi="TH Sarabun New" w:cs="TH Sarabun New"/>
-          <w:szCs w:val="24"/>
-        </w:rPr>
-        <w:t>………………………………………………………………………………………………………</w:t>
+          <w:rFonts w:ascii="TH Sarabun New" w:hAnsi="TH Sarabun New" w:cs="TH Sarabun New" w:hint="cs"/>
+          <w:szCs w:val="24"/>
+          <w:cs/>
+        </w:rPr>
+        <w:t>ไม่กินข้าวแกง</w:t>
       </w:r>
     </w:p>
     <w:tbl>
@@ -1462,6 +1478,14 @@
                 <w:szCs w:val="20"/>
               </w:rPr>
             </w:pPr>
+            <w:r>
+              <w:rPr>
+                <w:rFonts w:ascii="TH Sarabun New" w:hAnsi="TH Sarabun New" w:cs="TH Sarabun New"/>
+                <w:sz w:val="20"/>
+                <w:szCs w:val="20"/>
+              </w:rPr>
+              <w:t>670710123</w:t>
+            </w:r>
           </w:p>
         </w:tc>
         <w:tc>
@@ -1477,6 +1501,15 @@
                 <w:szCs w:val="20"/>
               </w:rPr>
             </w:pPr>
+            <w:r>
+              <w:rPr>
+                <w:rFonts w:ascii="TH Sarabun New" w:hAnsi="TH Sarabun New" w:cs="TH Sarabun New" w:hint="cs"/>
+                <w:sz w:val="20"/>
+                <w:szCs w:val="20"/>
+                <w:cs/>
+              </w:rPr>
+              <w:t>กัญญาณัฐ เขมนรากร</w:t>
+            </w:r>
           </w:p>
         </w:tc>
         <w:tc>
@@ -1518,6 +1551,15 @@
                 <w:szCs w:val="20"/>
               </w:rPr>
             </w:pPr>
+            <w:r>
+              <w:rPr>
+                <w:rFonts w:ascii="TH Sarabun New" w:hAnsi="TH Sarabun New" w:cs="TH Sarabun New" w:hint="cs"/>
+                <w:sz w:val="20"/>
+                <w:szCs w:val="20"/>
+                <w:cs/>
+              </w:rPr>
+              <w:t>670710131</w:t>
+            </w:r>
           </w:p>
         </w:tc>
         <w:tc>
@@ -1533,6 +1575,15 @@
                 <w:szCs w:val="20"/>
               </w:rPr>
             </w:pPr>
+            <w:r>
+              <w:rPr>
+                <w:rFonts w:ascii="TH Sarabun New" w:hAnsi="TH Sarabun New" w:cs="TH Sarabun New" w:hint="cs"/>
+                <w:sz w:val="20"/>
+                <w:szCs w:val="20"/>
+                <w:cs/>
+              </w:rPr>
+              <w:t>นทิบดี ช้างทอง</w:t>
+            </w:r>
           </w:p>
         </w:tc>
         <w:tc>
@@ -1575,6 +1626,15 @@
                 <w:szCs w:val="20"/>
               </w:rPr>
             </w:pPr>
+            <w:r>
+              <w:rPr>
+                <w:rFonts w:ascii="TH Sarabun New" w:hAnsi="TH Sarabun New" w:cs="TH Sarabun New" w:hint="cs"/>
+                <w:sz w:val="20"/>
+                <w:szCs w:val="20"/>
+                <w:cs/>
+              </w:rPr>
+              <w:t>670710258</w:t>
+            </w:r>
           </w:p>
         </w:tc>
         <w:tc>
@@ -1590,6 +1650,24 @@
                 <w:szCs w:val="20"/>
               </w:rPr>
             </w:pPr>
+            <w:r>
+              <w:rPr>
+                <w:rFonts w:ascii="TH Sarabun New" w:hAnsi="TH Sarabun New" w:cs="TH Sarabun New"/>
+                <w:sz w:val="20"/>
+                <w:szCs w:val="20"/>
+              </w:rPr>
+              <w:t xml:space="preserve">Sothea </w:t>
+            </w:r>
+            <w:proofErr w:type="spellStart"/>
+            <w:r>
+              <w:rPr>
+                <w:rFonts w:ascii="TH Sarabun New" w:hAnsi="TH Sarabun New" w:cs="TH Sarabun New"/>
+                <w:sz w:val="20"/>
+                <w:szCs w:val="20"/>
+              </w:rPr>
+              <w:t>Sokea</w:t>
+            </w:r>
+            <w:proofErr w:type="spellEnd"/>
           </w:p>
         </w:tc>
         <w:tc>
@@ -1632,6 +1710,14 @@
                 <w:szCs w:val="20"/>
               </w:rPr>
             </w:pPr>
+            <w:r>
+              <w:rPr>
+                <w:rFonts w:ascii="TH Sarabun New" w:hAnsi="TH Sarabun New" w:cs="TH Sarabun New"/>
+                <w:sz w:val="20"/>
+                <w:szCs w:val="20"/>
+              </w:rPr>
+              <w:t>670710259</w:t>
+            </w:r>
           </w:p>
         </w:tc>
         <w:tc>
@@ -1647,6 +1733,40 @@
                 <w:szCs w:val="20"/>
               </w:rPr>
             </w:pPr>
+            <w:proofErr w:type="spellStart"/>
+            <w:r>
+              <w:rPr>
+                <w:rFonts w:ascii="TH Sarabun New" w:hAnsi="TH Sarabun New" w:cs="TH Sarabun New"/>
+                <w:sz w:val="20"/>
+                <w:szCs w:val="20"/>
+              </w:rPr>
+              <w:t>Udtara</w:t>
+            </w:r>
+            <w:r>
+              <w:rPr>
+                <w:rFonts w:ascii="TH Sarabun New" w:hAnsi="TH Sarabun New" w:cs="TH Sarabun New"/>
+                <w:sz w:val="20"/>
+                <w:szCs w:val="20"/>
+              </w:rPr>
+              <w:t>k</w:t>
+            </w:r>
+            <w:r>
+              <w:rPr>
+                <w:rFonts w:ascii="TH Sarabun New" w:hAnsi="TH Sarabun New" w:cs="TH Sarabun New"/>
+                <w:sz w:val="20"/>
+                <w:szCs w:val="20"/>
+              </w:rPr>
+              <w:t>viseth</w:t>
+            </w:r>
+            <w:proofErr w:type="spellEnd"/>
+            <w:r>
+              <w:rPr>
+                <w:rFonts w:ascii="TH Sarabun New" w:hAnsi="TH Sarabun New" w:cs="TH Sarabun New"/>
+                <w:sz w:val="20"/>
+                <w:szCs w:val="20"/>
+              </w:rPr>
+              <w:t xml:space="preserve"> Lay</w:t>
+            </w:r>
           </w:p>
         </w:tc>
         <w:tc>
@@ -1732,63 +1852,6 @@
           </w:p>
         </w:tc>
       </w:tr>
-      <w:tr>
-        <w:tc>
-          <w:tcPr>
-            <w:tcW w:w="2132" w:type="dxa"/>
-          </w:tcPr>
-          <w:p>
-            <w:pPr>
-              <w:jc w:val="center"/>
-              <w:rPr>
-                <w:rFonts w:ascii="TH Sarabun New" w:hAnsi="TH Sarabun New" w:cs="TH Sarabun New"/>
-                <w:sz w:val="20"/>
-                <w:szCs w:val="20"/>
-              </w:rPr>
-            </w:pPr>
-          </w:p>
-        </w:tc>
-        <w:tc>
-          <w:tcPr>
-            <w:tcW w:w="4153" w:type="dxa"/>
-          </w:tcPr>
-          <w:p>
-            <w:pPr>
-              <w:jc w:val="center"/>
-              <w:rPr>
-                <w:rFonts w:ascii="TH Sarabun New" w:hAnsi="TH Sarabun New" w:cs="TH Sarabun New"/>
-                <w:sz w:val="20"/>
-                <w:szCs w:val="20"/>
-              </w:rPr>
-            </w:pPr>
-          </w:p>
-        </w:tc>
-        <w:tc>
-          <w:tcPr>
-            <w:tcW w:w="2440" w:type="dxa"/>
-          </w:tcPr>
-          <w:p>
-            <w:pPr>
-              <w:jc w:val="center"/>
-              <w:rPr>
-                <w:rFonts w:ascii="TH Sarabun New" w:hAnsi="TH Sarabun New" w:cs="TH Sarabun New"/>
-                <w:sz w:val="20"/>
-                <w:szCs w:val="20"/>
-                <w:cs/>
-              </w:rPr>
-            </w:pPr>
-            <w:r>
-              <w:rPr>
-                <w:rFonts w:ascii="TH Sarabun New" w:hAnsi="TH Sarabun New" w:cs="TH Sarabun New" w:hint="cs"/>
-                <w:sz w:val="20"/>
-                <w:szCs w:val="20"/>
-                <w:cs/>
-              </w:rPr>
-              <w:t>สมาชิก</w:t>
-            </w:r>
-          </w:p>
-        </w:tc>
-      </w:tr>
     </w:tbl>
     <w:p>
       <w:pPr>
@@ -1828,20 +1891,20 @@
     <w:tbl>
       <w:tblPr>
         <w:tblStyle w:val="TableGrid"/>
-        <w:tblW w:w="9540" w:type="dxa"/>
+        <w:tblW w:w="16521" w:type="dxa"/>
         <w:tblInd w:w="85" w:type="dxa"/>
         <w:tblLook w:val="04A0" w:firstRow="1" w:lastRow="0" w:firstColumn="1" w:lastColumn="0" w:noHBand="0" w:noVBand="1"/>
       </w:tblPr>
       <w:tblGrid>
-        <w:gridCol w:w="810"/>
-        <w:gridCol w:w="2340"/>
-        <w:gridCol w:w="3420"/>
-        <w:gridCol w:w="2970"/>
+        <w:gridCol w:w="536"/>
+        <w:gridCol w:w="1508"/>
+        <w:gridCol w:w="862"/>
+        <w:gridCol w:w="13615"/>
       </w:tblGrid>
       <w:tr>
         <w:tc>
           <w:tcPr>
-            <w:tcW w:w="810" w:type="dxa"/>
+            <w:tcW w:w="536" w:type="dxa"/>
             <w:vAlign w:val="center"/>
           </w:tcPr>
           <w:p>
@@ -1866,7 +1929,7 @@
         </w:tc>
         <w:tc>
           <w:tcPr>
-            <w:tcW w:w="2340" w:type="dxa"/>
+            <w:tcW w:w="1508" w:type="dxa"/>
             <w:vAlign w:val="center"/>
           </w:tcPr>
           <w:p>
@@ -1891,7 +1954,7 @@
         </w:tc>
         <w:tc>
           <w:tcPr>
-            <w:tcW w:w="3420" w:type="dxa"/>
+            <w:tcW w:w="862" w:type="dxa"/>
             <w:vAlign w:val="center"/>
           </w:tcPr>
           <w:p>
@@ -1962,7 +2025,7 @@
         </w:tc>
         <w:tc>
           <w:tcPr>
-            <w:tcW w:w="2970" w:type="dxa"/>
+            <w:tcW w:w="13615" w:type="dxa"/>
             <w:vAlign w:val="center"/>
           </w:tcPr>
           <w:p>
@@ -2026,7 +2089,7 @@
       <w:tr>
         <w:tc>
           <w:tcPr>
-            <w:tcW w:w="810" w:type="dxa"/>
+            <w:tcW w:w="536" w:type="dxa"/>
           </w:tcPr>
           <w:p>
             <w:pPr>
@@ -2037,58 +2100,94 @@
                 <w:szCs w:val="20"/>
               </w:rPr>
             </w:pPr>
+            <w:r>
+              <w:rPr>
+                <w:rFonts w:ascii="TH Sarabun New" w:hAnsi="TH Sarabun New" w:cs="TH Sarabun New"/>
+                <w:sz w:val="20"/>
+                <w:szCs w:val="20"/>
+              </w:rPr>
+              <w:t>1</w:t>
+            </w:r>
           </w:p>
         </w:tc>
         <w:tc>
           <w:tcPr>
-            <w:tcW w:w="2340" w:type="dxa"/>
+            <w:tcW w:w="1508" w:type="dxa"/>
           </w:tcPr>
           <w:p>
             <w:pPr>
               <w:jc w:val="center"/>
               <w:rPr>
                 <w:rFonts w:ascii="TH Sarabun New" w:hAnsi="TH Sarabun New" w:cs="TH Sarabun New"/>
-                <w:sz w:val="20"/>
-                <w:szCs w:val="20"/>
-              </w:rPr>
-            </w:pPr>
+                <w:b/>
+                <w:bCs/>
+                <w:sz w:val="20"/>
+                <w:szCs w:val="20"/>
+              </w:rPr>
+            </w:pPr>
+            <w:r>
+              <w:rPr>
+                <w:rFonts w:ascii="TH Sarabun New" w:hAnsi="TH Sarabun New" w:cs="TH Sarabun New"/>
+                <w:b/>
+                <w:bCs/>
+                <w:sz w:val="20"/>
+                <w:szCs w:val="20"/>
+              </w:rPr>
+              <w:t>Sleep vs. GPA in College</w:t>
+            </w:r>
           </w:p>
         </w:tc>
         <w:tc>
           <w:tcPr>
-            <w:tcW w:w="3420" w:type="dxa"/>
+            <w:tcW w:w="862" w:type="dxa"/>
           </w:tcPr>
           <w:p>
             <w:pPr>
               <w:jc w:val="center"/>
               <w:rPr>
-                <w:rFonts w:ascii="TH Sarabun New" w:hAnsi="TH Sarabun New" w:cs="TH Sarabun New"/>
-                <w:sz w:val="20"/>
-                <w:szCs w:val="20"/>
-              </w:rPr>
-            </w:pPr>
+                <w:rFonts w:ascii="TH Sarabun New" w:hAnsi="TH Sarabun New" w:cs="TH Sarabun New" w:hint="cs"/>
+                <w:sz w:val="20"/>
+                <w:szCs w:val="20"/>
+              </w:rPr>
+            </w:pPr>
+            <w:r>
+              <w:rPr>
+                <w:rFonts w:ascii="TH Sarabun New" w:hAnsi="TH Sarabun New" w:cs="TH Sarabun New" w:hint="cs"/>
+                <w:sz w:val="20"/>
+                <w:szCs w:val="20"/>
+                <w:cs/>
+              </w:rPr>
+              <w:t>เก็บข้อมูลจากนักศึกษาจาก 3 มหาลัย เก็บข้อมูลเกี่ยวกับการนอน และเกรดของนักศึกษา</w:t>
+            </w:r>
           </w:p>
         </w:tc>
         <w:tc>
           <w:tcPr>
-            <w:tcW w:w="2970" w:type="dxa"/>
+            <w:tcW w:w="13615" w:type="dxa"/>
           </w:tcPr>
           <w:p>
             <w:pPr>
-              <w:jc w:val="center"/>
-              <w:rPr>
-                <w:rFonts w:ascii="TH Sarabun New" w:hAnsi="TH Sarabun New" w:cs="TH Sarabun New"/>
-                <w:sz w:val="20"/>
-                <w:szCs w:val="20"/>
-              </w:rPr>
-            </w:pPr>
+              <w:rPr>
+                <w:rFonts w:ascii="TH Sarabun New" w:hAnsi="TH Sarabun New" w:cs="TH Sarabun New"/>
+                <w:sz w:val="20"/>
+                <w:szCs w:val="20"/>
+              </w:rPr>
+            </w:pPr>
+            <w:r>
+              <w:rPr>
+                <w:rFonts w:ascii="TH Sarabun New" w:hAnsi="TH Sarabun New" w:cs="TH Sarabun New"/>
+                <w:sz w:val="20"/>
+                <w:szCs w:val="20"/>
+              </w:rPr>
+              <w:t>https://www.kaggle.com/datasets/kylefengkfeng209/sleep-vs-gpa-in-college</w:t>
+            </w:r>
           </w:p>
         </w:tc>
       </w:tr>
       <w:tr>
         <w:tc>
           <w:tcPr>
-            <w:tcW w:w="810" w:type="dxa"/>
+            <w:tcW w:w="536" w:type="dxa"/>
           </w:tcPr>
           <w:p>
             <w:pPr>
@@ -2099,12 +2198,42 @@
                 <w:szCs w:val="20"/>
               </w:rPr>
             </w:pPr>
+            <w:r>
+              <w:rPr>
+                <w:rFonts w:ascii="TH Sarabun New" w:hAnsi="TH Sarabun New" w:cs="TH Sarabun New"/>
+                <w:sz w:val="20"/>
+                <w:szCs w:val="20"/>
+              </w:rPr>
+              <w:t>2</w:t>
+            </w:r>
           </w:p>
         </w:tc>
         <w:tc>
           <w:tcPr>
-            <w:tcW w:w="2340" w:type="dxa"/>
+            <w:tcW w:w="1508" w:type="dxa"/>
           </w:tcPr>
+          <w:p>
+            <w:pPr>
+              <w:jc w:val="center"/>
+              <w:rPr>
+                <w:rFonts w:ascii="TH Sarabun New" w:hAnsi="TH Sarabun New" w:cs="TH Sarabun New"/>
+                <w:b/>
+                <w:bCs/>
+                <w:sz w:val="20"/>
+                <w:szCs w:val="20"/>
+              </w:rPr>
+            </w:pPr>
+            <w:r>
+              <w:rPr>
+                <w:rFonts w:ascii="TH Sarabun New" w:hAnsi="TH Sarabun New" w:cs="TH Sarabun New"/>
+                <w:b/>
+                <w:bCs/>
+                <w:sz w:val="20"/>
+                <w:szCs w:val="20"/>
+              </w:rPr>
+              <w:t>Laptop Battery Health Prediction Dataset</w:t>
+            </w:r>
+          </w:p>
           <w:p>
             <w:pPr>
               <w:jc w:val="center"/>
@@ -2118,39 +2247,56 @@
         </w:tc>
         <w:tc>
           <w:tcPr>
-            <w:tcW w:w="3420" w:type="dxa"/>
+            <w:tcW w:w="862" w:type="dxa"/>
           </w:tcPr>
           <w:p>
             <w:pPr>
               <w:jc w:val="center"/>
               <w:rPr>
-                <w:rFonts w:ascii="TH Sarabun New" w:hAnsi="TH Sarabun New" w:cs="TH Sarabun New"/>
-                <w:sz w:val="20"/>
-                <w:szCs w:val="20"/>
-              </w:rPr>
-            </w:pPr>
+                <w:rFonts w:ascii="TH Sarabun New" w:hAnsi="TH Sarabun New" w:cs="TH Sarabun New" w:hint="cs"/>
+                <w:sz w:val="20"/>
+                <w:szCs w:val="20"/>
+                <w:cs/>
+              </w:rPr>
+            </w:pPr>
+            <w:r>
+              <w:rPr>
+                <w:rFonts w:ascii="TH Sarabun New" w:hAnsi="TH Sarabun New" w:cs="TH Sarabun New" w:hint="cs"/>
+                <w:sz w:val="20"/>
+                <w:szCs w:val="20"/>
+                <w:cs/>
+              </w:rPr>
+              <w:t>คาดการณ์สุภาพของแบตเตอรี่จากการใช้งาน</w:t>
+            </w:r>
           </w:p>
         </w:tc>
         <w:tc>
           <w:tcPr>
-            <w:tcW w:w="2970" w:type="dxa"/>
+            <w:tcW w:w="13615" w:type="dxa"/>
           </w:tcPr>
           <w:p>
             <w:pPr>
-              <w:jc w:val="center"/>
-              <w:rPr>
-                <w:rFonts w:ascii="TH Sarabun New" w:hAnsi="TH Sarabun New" w:cs="TH Sarabun New"/>
-                <w:sz w:val="20"/>
-                <w:szCs w:val="20"/>
-              </w:rPr>
-            </w:pPr>
+              <w:rPr>
+                <w:rFonts w:ascii="TH Sarabun New" w:hAnsi="TH Sarabun New" w:cs="TH Sarabun New"/>
+                <w:sz w:val="20"/>
+                <w:szCs w:val="20"/>
+              </w:rPr>
+            </w:pPr>
+            <w:r>
+              <w:rPr>
+                <w:rFonts w:ascii="TH Sarabun New" w:hAnsi="TH Sarabun New" w:cs="TH Sarabun New"/>
+                <w:sz w:val="20"/>
+                <w:szCs w:val="20"/>
+              </w:rPr>
+              <w:t>https://www.kaggle.com/datasets/dharmendrapandit12/laptop-battery-health-dataset?fbclid=IwY2xjawTf9mZwZG9mAWV4dG4DYWVtAjEwAGJyaWQRMUhGRWVjcXMzYnY2THNQdnJzcnRjBmFwcF9pZBAyMjIwMzkxNzg4MjAwODkyAAEeQdOIfaOUcwjMBX9L6OeZuMSJpeypniRdudVi6g8hSf9p2Xt4JQ32Y-Rnyoc_aem_GSN4gFyrObP2zR0sRld-VA</w:t>
+            </w:r>
           </w:p>
         </w:tc>
       </w:tr>
       <w:tr>
         <w:tc>
           <w:tcPr>
-            <w:tcW w:w="810" w:type="dxa"/>
+            <w:tcW w:w="536" w:type="dxa"/>
           </w:tcPr>
           <w:p>
             <w:pPr>
@@ -2161,12 +2307,42 @@
                 <w:szCs w:val="20"/>
               </w:rPr>
             </w:pPr>
+            <w:r>
+              <w:rPr>
+                <w:rFonts w:ascii="TH Sarabun New" w:hAnsi="TH Sarabun New" w:cs="TH Sarabun New"/>
+                <w:sz w:val="20"/>
+                <w:szCs w:val="20"/>
+              </w:rPr>
+              <w:t>3</w:t>
+            </w:r>
           </w:p>
         </w:tc>
         <w:tc>
           <w:tcPr>
-            <w:tcW w:w="2340" w:type="dxa"/>
+            <w:tcW w:w="1508" w:type="dxa"/>
           </w:tcPr>
+          <w:p>
+            <w:pPr>
+              <w:jc w:val="center"/>
+              <w:rPr>
+                <w:rFonts w:ascii="TH Sarabun New" w:hAnsi="TH Sarabun New" w:cs="TH Sarabun New"/>
+                <w:b/>
+                <w:bCs/>
+                <w:sz w:val="20"/>
+                <w:szCs w:val="20"/>
+              </w:rPr>
+            </w:pPr>
+            <w:r>
+              <w:rPr>
+                <w:rFonts w:ascii="TH Sarabun New" w:hAnsi="TH Sarabun New" w:cs="TH Sarabun New"/>
+                <w:b/>
+                <w:bCs/>
+                <w:sz w:val="20"/>
+                <w:szCs w:val="20"/>
+              </w:rPr>
+              <w:t>House Price Prediction Dataset (Clean &amp; Synthetic)</w:t>
+            </w:r>
+          </w:p>
           <w:p>
             <w:pPr>
               <w:jc w:val="center"/>
@@ -2180,39 +2356,324 @@
         </w:tc>
         <w:tc>
           <w:tcPr>
-            <w:tcW w:w="3420" w:type="dxa"/>
+            <w:tcW w:w="862" w:type="dxa"/>
           </w:tcPr>
           <w:p>
             <w:pPr>
               <w:jc w:val="center"/>
               <w:rPr>
-                <w:rFonts w:ascii="TH Sarabun New" w:hAnsi="TH Sarabun New" w:cs="TH Sarabun New"/>
-                <w:sz w:val="20"/>
-                <w:szCs w:val="20"/>
-              </w:rPr>
-            </w:pPr>
+                <w:rFonts w:ascii="TH Sarabun New" w:hAnsi="TH Sarabun New" w:cs="TH Sarabun New" w:hint="cs"/>
+                <w:sz w:val="20"/>
+                <w:szCs w:val="20"/>
+              </w:rPr>
+            </w:pPr>
+            <w:r>
+              <w:rPr>
+                <w:rFonts w:ascii="TH Sarabun New" w:hAnsi="TH Sarabun New" w:cs="TH Sarabun New" w:hint="cs"/>
+                <w:sz w:val="20"/>
+                <w:szCs w:val="20"/>
+                <w:cs/>
+              </w:rPr>
+              <w:t>คาดการณ์ราคาบ้าน จากข้อมูลเกี่ยวกับ ขนาดบ้าน ระยะทางที่ห่างจากตัวเมือง และอื่น ๆ</w:t>
+            </w:r>
           </w:p>
         </w:tc>
         <w:tc>
           <w:tcPr>
-            <w:tcW w:w="2970" w:type="dxa"/>
+            <w:tcW w:w="13615" w:type="dxa"/>
           </w:tcPr>
           <w:p>
             <w:pPr>
-              <w:jc w:val="center"/>
-              <w:rPr>
-                <w:rFonts w:ascii="TH Sarabun New" w:hAnsi="TH Sarabun New" w:cs="TH Sarabun New"/>
-                <w:sz w:val="20"/>
-                <w:szCs w:val="20"/>
-              </w:rPr>
-            </w:pPr>
+              <w:rPr>
+                <w:rFonts w:ascii="TH Sarabun New" w:hAnsi="TH Sarabun New" w:cs="TH Sarabun New"/>
+                <w:sz w:val="20"/>
+                <w:szCs w:val="20"/>
+              </w:rPr>
+            </w:pPr>
+            <w:r>
+              <w:rPr>
+                <w:rFonts w:ascii="TH Sarabun New" w:hAnsi="TH Sarabun New" w:cs="TH Sarabun New"/>
+                <w:sz w:val="20"/>
+                <w:szCs w:val="20"/>
+              </w:rPr>
+              <w:t>https://www.kaggle.com/datasets/updateabdullahi/house-price-prediction-dataset-clean-and-synthetic?fbclid=IwY</w:t>
+            </w:r>
+            <w:r>
+              <w:rPr>
+                <w:rFonts w:ascii="TH Sarabun New" w:hAnsi="TH Sarabun New" w:cs="TH Sarabun New"/>
+                <w:sz w:val="20"/>
+                <w:szCs w:val="20"/>
+                <w:cs/>
+              </w:rPr>
+              <w:t>2</w:t>
+            </w:r>
+            <w:proofErr w:type="spellStart"/>
+            <w:r>
+              <w:rPr>
+                <w:rFonts w:ascii="TH Sarabun New" w:hAnsi="TH Sarabun New" w:cs="TH Sarabun New"/>
+                <w:sz w:val="20"/>
+                <w:szCs w:val="20"/>
+              </w:rPr>
+              <w:t>xjawTf-DNwZG</w:t>
+            </w:r>
+            <w:proofErr w:type="spellEnd"/>
+            <w:r>
+              <w:rPr>
+                <w:rFonts w:ascii="TH Sarabun New" w:hAnsi="TH Sarabun New" w:cs="TH Sarabun New"/>
+                <w:sz w:val="20"/>
+                <w:szCs w:val="20"/>
+                <w:cs/>
+              </w:rPr>
+              <w:t>9</w:t>
+            </w:r>
+            <w:proofErr w:type="spellStart"/>
+            <w:r>
+              <w:rPr>
+                <w:rFonts w:ascii="TH Sarabun New" w:hAnsi="TH Sarabun New" w:cs="TH Sarabun New"/>
+                <w:sz w:val="20"/>
+                <w:szCs w:val="20"/>
+              </w:rPr>
+              <w:t>mAWV</w:t>
+            </w:r>
+            <w:proofErr w:type="spellEnd"/>
+            <w:r>
+              <w:rPr>
+                <w:rFonts w:ascii="TH Sarabun New" w:hAnsi="TH Sarabun New" w:cs="TH Sarabun New"/>
+                <w:sz w:val="20"/>
+                <w:szCs w:val="20"/>
+                <w:cs/>
+              </w:rPr>
+              <w:t>4</w:t>
+            </w:r>
+            <w:proofErr w:type="spellStart"/>
+            <w:r>
+              <w:rPr>
+                <w:rFonts w:ascii="TH Sarabun New" w:hAnsi="TH Sarabun New" w:cs="TH Sarabun New"/>
+                <w:sz w:val="20"/>
+                <w:szCs w:val="20"/>
+              </w:rPr>
+              <w:t>dG</w:t>
+            </w:r>
+            <w:proofErr w:type="spellEnd"/>
+            <w:r>
+              <w:rPr>
+                <w:rFonts w:ascii="TH Sarabun New" w:hAnsi="TH Sarabun New" w:cs="TH Sarabun New"/>
+                <w:sz w:val="20"/>
+                <w:szCs w:val="20"/>
+                <w:cs/>
+              </w:rPr>
+              <w:t>4</w:t>
+            </w:r>
+            <w:proofErr w:type="spellStart"/>
+            <w:r>
+              <w:rPr>
+                <w:rFonts w:ascii="TH Sarabun New" w:hAnsi="TH Sarabun New" w:cs="TH Sarabun New"/>
+                <w:sz w:val="20"/>
+                <w:szCs w:val="20"/>
+              </w:rPr>
+              <w:t>DYWVtAjEwAGJyaWQRMUhGRWVjcXMzYnY</w:t>
+            </w:r>
+            <w:proofErr w:type="spellEnd"/>
+            <w:r>
+              <w:rPr>
+                <w:rFonts w:ascii="TH Sarabun New" w:hAnsi="TH Sarabun New" w:cs="TH Sarabun New"/>
+                <w:sz w:val="20"/>
+                <w:szCs w:val="20"/>
+                <w:cs/>
+              </w:rPr>
+              <w:t>2</w:t>
+            </w:r>
+            <w:proofErr w:type="spellStart"/>
+            <w:r>
+              <w:rPr>
+                <w:rFonts w:ascii="TH Sarabun New" w:hAnsi="TH Sarabun New" w:cs="TH Sarabun New"/>
+                <w:sz w:val="20"/>
+                <w:szCs w:val="20"/>
+              </w:rPr>
+              <w:t>THNQdnJzcnRjBmFwcF</w:t>
+            </w:r>
+            <w:proofErr w:type="spellEnd"/>
+            <w:r>
+              <w:rPr>
+                <w:rFonts w:ascii="TH Sarabun New" w:hAnsi="TH Sarabun New" w:cs="TH Sarabun New"/>
+                <w:sz w:val="20"/>
+                <w:szCs w:val="20"/>
+                <w:cs/>
+              </w:rPr>
+              <w:t>9</w:t>
+            </w:r>
+            <w:proofErr w:type="spellStart"/>
+            <w:r>
+              <w:rPr>
+                <w:rFonts w:ascii="TH Sarabun New" w:hAnsi="TH Sarabun New" w:cs="TH Sarabun New"/>
+                <w:sz w:val="20"/>
+                <w:szCs w:val="20"/>
+              </w:rPr>
+              <w:t>pZBAyMjIwMzkxNzg</w:t>
+            </w:r>
+            <w:proofErr w:type="spellEnd"/>
+            <w:r>
+              <w:rPr>
+                <w:rFonts w:ascii="TH Sarabun New" w:hAnsi="TH Sarabun New" w:cs="TH Sarabun New"/>
+                <w:sz w:val="20"/>
+                <w:szCs w:val="20"/>
+                <w:cs/>
+              </w:rPr>
+              <w:t>4</w:t>
+            </w:r>
+            <w:proofErr w:type="spellStart"/>
+            <w:r>
+              <w:rPr>
+                <w:rFonts w:ascii="TH Sarabun New" w:hAnsi="TH Sarabun New" w:cs="TH Sarabun New"/>
+                <w:sz w:val="20"/>
+                <w:szCs w:val="20"/>
+              </w:rPr>
+              <w:t>MjAwODkyAAEeLM</w:t>
+            </w:r>
+            <w:proofErr w:type="spellEnd"/>
+            <w:r>
+              <w:rPr>
+                <w:rFonts w:ascii="TH Sarabun New" w:hAnsi="TH Sarabun New" w:cs="TH Sarabun New"/>
+                <w:sz w:val="20"/>
+                <w:szCs w:val="20"/>
+                <w:cs/>
+              </w:rPr>
+              <w:t>1</w:t>
+            </w:r>
+            <w:proofErr w:type="spellStart"/>
+            <w:r>
+              <w:rPr>
+                <w:rFonts w:ascii="TH Sarabun New" w:hAnsi="TH Sarabun New" w:cs="TH Sarabun New"/>
+                <w:sz w:val="20"/>
+                <w:szCs w:val="20"/>
+              </w:rPr>
+              <w:t>UGPBJfEE_z</w:t>
+            </w:r>
+            <w:proofErr w:type="spellEnd"/>
+            <w:r>
+              <w:rPr>
+                <w:rFonts w:ascii="TH Sarabun New" w:hAnsi="TH Sarabun New" w:cs="TH Sarabun New"/>
+                <w:sz w:val="20"/>
+                <w:szCs w:val="20"/>
+                <w:cs/>
+              </w:rPr>
+              <w:t>2</w:t>
+            </w:r>
+            <w:proofErr w:type="spellStart"/>
+            <w:r>
+              <w:rPr>
+                <w:rFonts w:ascii="TH Sarabun New" w:hAnsi="TH Sarabun New" w:cs="TH Sarabun New"/>
+                <w:sz w:val="20"/>
+                <w:szCs w:val="20"/>
+              </w:rPr>
+              <w:t>VoVAzKAnoz</w:t>
+            </w:r>
+            <w:proofErr w:type="spellEnd"/>
+            <w:r>
+              <w:rPr>
+                <w:rFonts w:ascii="TH Sarabun New" w:hAnsi="TH Sarabun New" w:cs="TH Sarabun New"/>
+                <w:sz w:val="20"/>
+                <w:szCs w:val="20"/>
+                <w:cs/>
+              </w:rPr>
+              <w:t>5</w:t>
+            </w:r>
+            <w:proofErr w:type="spellStart"/>
+            <w:r>
+              <w:rPr>
+                <w:rFonts w:ascii="TH Sarabun New" w:hAnsi="TH Sarabun New" w:cs="TH Sarabun New"/>
+                <w:sz w:val="20"/>
+                <w:szCs w:val="20"/>
+              </w:rPr>
+              <w:t>TdmxpYau_k</w:t>
+            </w:r>
+            <w:proofErr w:type="spellEnd"/>
+            <w:r>
+              <w:rPr>
+                <w:rFonts w:ascii="TH Sarabun New" w:hAnsi="TH Sarabun New" w:cs="TH Sarabun New"/>
+                <w:sz w:val="20"/>
+                <w:szCs w:val="20"/>
+              </w:rPr>
+              <w:t>-</w:t>
+            </w:r>
+            <w:r>
+              <w:rPr>
+                <w:rFonts w:ascii="TH Sarabun New" w:hAnsi="TH Sarabun New" w:cs="TH Sarabun New"/>
+                <w:sz w:val="20"/>
+                <w:szCs w:val="20"/>
+                <w:cs/>
+              </w:rPr>
+              <w:t>9</w:t>
+            </w:r>
+            <w:r>
+              <w:rPr>
+                <w:rFonts w:ascii="TH Sarabun New" w:hAnsi="TH Sarabun New" w:cs="TH Sarabun New"/>
+                <w:sz w:val="20"/>
+                <w:szCs w:val="20"/>
+              </w:rPr>
+              <w:t>P</w:t>
+            </w:r>
+            <w:r>
+              <w:rPr>
+                <w:rFonts w:ascii="TH Sarabun New" w:hAnsi="TH Sarabun New" w:cs="TH Sarabun New"/>
+                <w:sz w:val="20"/>
+                <w:szCs w:val="20"/>
+                <w:cs/>
+              </w:rPr>
+              <w:t>4</w:t>
+            </w:r>
+            <w:r>
+              <w:rPr>
+                <w:rFonts w:ascii="TH Sarabun New" w:hAnsi="TH Sarabun New" w:cs="TH Sarabun New"/>
+                <w:sz w:val="20"/>
+                <w:szCs w:val="20"/>
+              </w:rPr>
+              <w:t>krUPPALtcg-wYWaHzmpE_</w:t>
+            </w:r>
+            <w:proofErr w:type="spellStart"/>
+            <w:r>
+              <w:rPr>
+                <w:rFonts w:ascii="TH Sarabun New" w:hAnsi="TH Sarabun New" w:cs="TH Sarabun New"/>
+                <w:sz w:val="20"/>
+                <w:szCs w:val="20"/>
+              </w:rPr>
+              <w:t>aem</w:t>
+            </w:r>
+            <w:proofErr w:type="spellEnd"/>
+            <w:r>
+              <w:rPr>
+                <w:rFonts w:ascii="TH Sarabun New" w:hAnsi="TH Sarabun New" w:cs="TH Sarabun New"/>
+                <w:sz w:val="20"/>
+                <w:szCs w:val="20"/>
+              </w:rPr>
+              <w:t>__d</w:t>
+            </w:r>
+            <w:r>
+              <w:rPr>
+                <w:rFonts w:ascii="TH Sarabun New" w:hAnsi="TH Sarabun New" w:cs="TH Sarabun New"/>
+                <w:sz w:val="20"/>
+                <w:szCs w:val="20"/>
+                <w:cs/>
+              </w:rPr>
+              <w:t>306</w:t>
+            </w:r>
+            <w:proofErr w:type="spellStart"/>
+            <w:r>
+              <w:rPr>
+                <w:rFonts w:ascii="TH Sarabun New" w:hAnsi="TH Sarabun New" w:cs="TH Sarabun New"/>
+                <w:sz w:val="20"/>
+                <w:szCs w:val="20"/>
+              </w:rPr>
+              <w:t>LBhYnhjkpWDdOOwuA</w:t>
+            </w:r>
+            <w:proofErr w:type="spellEnd"/>
           </w:p>
         </w:tc>
       </w:tr>
       <w:tr>
         <w:tc>
           <w:tcPr>
-            <w:tcW w:w="810" w:type="dxa"/>
+            <w:tcW w:w="536" w:type="dxa"/>
           </w:tcPr>
           <w:p>
             <w:pPr>
@@ -2223,12 +2684,45 @@
                 <w:szCs w:val="20"/>
               </w:rPr>
             </w:pPr>
+            <w:r>
+              <w:rPr>
+                <w:rFonts w:ascii="TH Sarabun New" w:hAnsi="TH Sarabun New" w:cs="TH Sarabun New" w:hint="cs"/>
+                <w:sz w:val="20"/>
+                <w:szCs w:val="20"/>
+                <w:cs/>
+              </w:rPr>
+              <w:t>4</w:t>
+            </w:r>
           </w:p>
         </w:tc>
         <w:tc>
           <w:tcPr>
-            <w:tcW w:w="2340" w:type="dxa"/>
+            <w:tcW w:w="1508" w:type="dxa"/>
           </w:tcPr>
+          <w:p>
+            <w:pPr>
+              <w:jc w:val="center"/>
+              <w:rPr>
+                <w:rFonts w:ascii="TH Sarabun New" w:hAnsi="TH Sarabun New" w:cs="TH Sarabun New"/>
+                <w:b/>
+                <w:bCs/>
+                <w:sz w:val="20"/>
+                <w:szCs w:val="20"/>
+              </w:rPr>
+            </w:pPr>
+            <w:proofErr w:type="spellStart"/>
+            <w:r>
+              <w:rPr>
+                <w:rFonts w:ascii="TH Sarabun New" w:hAnsi="TH Sarabun New" w:cs="TH Sarabun New"/>
+                <w:b/>
+                <w:bCs/>
+                <w:sz w:val="20"/>
+                <w:szCs w:val="20"/>
+              </w:rPr>
+              <w:t>ai_impact_on_health</w:t>
+            </w:r>
+            <w:proofErr w:type="spellEnd"/>
+          </w:p>
           <w:p>
             <w:pPr>
               <w:jc w:val="center"/>
@@ -2242,94 +2736,434 @@
         </w:tc>
         <w:tc>
           <w:tcPr>
-            <w:tcW w:w="3420" w:type="dxa"/>
+            <w:tcW w:w="862" w:type="dxa"/>
           </w:tcPr>
           <w:p>
             <w:pPr>
               <w:jc w:val="center"/>
               <w:rPr>
-                <w:rFonts w:ascii="TH Sarabun New" w:hAnsi="TH Sarabun New" w:cs="TH Sarabun New"/>
-                <w:sz w:val="20"/>
-                <w:szCs w:val="20"/>
-              </w:rPr>
-            </w:pPr>
+                <w:rFonts w:ascii="TH Sarabun New" w:hAnsi="TH Sarabun New" w:cs="TH Sarabun New" w:hint="cs"/>
+                <w:sz w:val="20"/>
+                <w:szCs w:val="20"/>
+              </w:rPr>
+            </w:pPr>
+            <w:r>
+              <w:rPr>
+                <w:rFonts w:ascii="TH Sarabun New" w:hAnsi="TH Sarabun New" w:cs="TH Sarabun New" w:hint="cs"/>
+                <w:sz w:val="20"/>
+                <w:szCs w:val="20"/>
+                <w:cs/>
+              </w:rPr>
+              <w:t>ผลกระทบของร่างกายจากการใช้เอไอ</w:t>
+            </w:r>
           </w:p>
         </w:tc>
         <w:tc>
           <w:tcPr>
-            <w:tcW w:w="2970" w:type="dxa"/>
+            <w:tcW w:w="13615" w:type="dxa"/>
           </w:tcPr>
           <w:p>
             <w:pPr>
-              <w:jc w:val="center"/>
-              <w:rPr>
-                <w:rFonts w:ascii="TH Sarabun New" w:hAnsi="TH Sarabun New" w:cs="TH Sarabun New"/>
-                <w:sz w:val="20"/>
-                <w:szCs w:val="20"/>
-              </w:rPr>
-            </w:pPr>
-          </w:p>
-        </w:tc>
-      </w:tr>
-      <w:tr>
-        <w:tc>
-          <w:tcPr>
-            <w:tcW w:w="810" w:type="dxa"/>
-          </w:tcPr>
-          <w:p>
-            <w:pPr>
-              <w:jc w:val="center"/>
-              <w:rPr>
-                <w:rFonts w:ascii="TH Sarabun New" w:hAnsi="TH Sarabun New" w:cs="TH Sarabun New"/>
-                <w:sz w:val="20"/>
-                <w:szCs w:val="20"/>
-              </w:rPr>
-            </w:pPr>
-          </w:p>
-        </w:tc>
-        <w:tc>
-          <w:tcPr>
-            <w:tcW w:w="2340" w:type="dxa"/>
-          </w:tcPr>
-          <w:p>
-            <w:pPr>
-              <w:jc w:val="center"/>
-              <w:rPr>
-                <w:rFonts w:ascii="TH Sarabun New" w:hAnsi="TH Sarabun New" w:cs="TH Sarabun New"/>
-                <w:sz w:val="20"/>
-                <w:szCs w:val="20"/>
-              </w:rPr>
-            </w:pPr>
-          </w:p>
-        </w:tc>
-        <w:tc>
-          <w:tcPr>
-            <w:tcW w:w="3420" w:type="dxa"/>
-          </w:tcPr>
-          <w:p>
-            <w:pPr>
-              <w:jc w:val="center"/>
-              <w:rPr>
-                <w:rFonts w:ascii="TH Sarabun New" w:hAnsi="TH Sarabun New" w:cs="TH Sarabun New"/>
-                <w:sz w:val="20"/>
-                <w:szCs w:val="20"/>
-              </w:rPr>
-            </w:pPr>
-          </w:p>
-        </w:tc>
-        <w:tc>
-          <w:tcPr>
-            <w:tcW w:w="2970" w:type="dxa"/>
-          </w:tcPr>
-          <w:p>
-            <w:pPr>
-              <w:jc w:val="center"/>
-              <w:rPr>
-                <w:rFonts w:ascii="TH Sarabun New" w:hAnsi="TH Sarabun New" w:cs="TH Sarabun New"/>
-                <w:sz w:val="20"/>
-                <w:szCs w:val="20"/>
-              </w:rPr>
-            </w:pPr>
+              <w:rPr>
+                <w:rFonts w:ascii="TH Sarabun New" w:hAnsi="TH Sarabun New" w:cs="TH Sarabun New"/>
+                <w:sz w:val="20"/>
+                <w:szCs w:val="20"/>
+              </w:rPr>
+            </w:pPr>
+            <w:r>
+              <w:rPr>
+                <w:rFonts w:ascii="TH Sarabun New" w:hAnsi="TH Sarabun New" w:cs="TH Sarabun New"/>
+                <w:sz w:val="20"/>
+                <w:szCs w:val="20"/>
+              </w:rPr>
+              <w:t>https://www.kaggle.com/datasets/gauravjhaeigenvector/ai-impact-on-health?fbclid=IwY</w:t>
+            </w:r>
+            <w:r>
+              <w:rPr>
+                <w:rFonts w:ascii="TH Sarabun New" w:hAnsi="TH Sarabun New" w:cs="TH Sarabun New"/>
+                <w:sz w:val="20"/>
+                <w:szCs w:val="20"/>
+                <w:cs/>
+              </w:rPr>
+              <w:t>2</w:t>
+            </w:r>
+            <w:proofErr w:type="spellStart"/>
+            <w:r>
+              <w:rPr>
+                <w:rFonts w:ascii="TH Sarabun New" w:hAnsi="TH Sarabun New" w:cs="TH Sarabun New"/>
+                <w:sz w:val="20"/>
+                <w:szCs w:val="20"/>
+              </w:rPr>
+              <w:t>xjawTf-DBwZG</w:t>
+            </w:r>
+            <w:proofErr w:type="spellEnd"/>
+            <w:r>
+              <w:rPr>
+                <w:rFonts w:ascii="TH Sarabun New" w:hAnsi="TH Sarabun New" w:cs="TH Sarabun New"/>
+                <w:sz w:val="20"/>
+                <w:szCs w:val="20"/>
+                <w:cs/>
+              </w:rPr>
+              <w:t>9</w:t>
+            </w:r>
+            <w:proofErr w:type="spellStart"/>
+            <w:r>
+              <w:rPr>
+                <w:rFonts w:ascii="TH Sarabun New" w:hAnsi="TH Sarabun New" w:cs="TH Sarabun New"/>
+                <w:sz w:val="20"/>
+                <w:szCs w:val="20"/>
+              </w:rPr>
+              <w:t>mAWV</w:t>
+            </w:r>
+            <w:proofErr w:type="spellEnd"/>
+            <w:r>
+              <w:rPr>
+                <w:rFonts w:ascii="TH Sarabun New" w:hAnsi="TH Sarabun New" w:cs="TH Sarabun New"/>
+                <w:sz w:val="20"/>
+                <w:szCs w:val="20"/>
+                <w:cs/>
+              </w:rPr>
+              <w:t>4</w:t>
+            </w:r>
+            <w:proofErr w:type="spellStart"/>
+            <w:r>
+              <w:rPr>
+                <w:rFonts w:ascii="TH Sarabun New" w:hAnsi="TH Sarabun New" w:cs="TH Sarabun New"/>
+                <w:sz w:val="20"/>
+                <w:szCs w:val="20"/>
+              </w:rPr>
+              <w:t>dG</w:t>
+            </w:r>
+            <w:proofErr w:type="spellEnd"/>
+            <w:r>
+              <w:rPr>
+                <w:rFonts w:ascii="TH Sarabun New" w:hAnsi="TH Sarabun New" w:cs="TH Sarabun New"/>
+                <w:sz w:val="20"/>
+                <w:szCs w:val="20"/>
+                <w:cs/>
+              </w:rPr>
+              <w:t>4</w:t>
+            </w:r>
+            <w:proofErr w:type="spellStart"/>
+            <w:r>
+              <w:rPr>
+                <w:rFonts w:ascii="TH Sarabun New" w:hAnsi="TH Sarabun New" w:cs="TH Sarabun New"/>
+                <w:sz w:val="20"/>
+                <w:szCs w:val="20"/>
+              </w:rPr>
+              <w:t>DYWVtAjEwAGJyaWQRMUhGRWVjcXMzYnY</w:t>
+            </w:r>
+            <w:proofErr w:type="spellEnd"/>
+            <w:r>
+              <w:rPr>
+                <w:rFonts w:ascii="TH Sarabun New" w:hAnsi="TH Sarabun New" w:cs="TH Sarabun New"/>
+                <w:sz w:val="20"/>
+                <w:szCs w:val="20"/>
+                <w:cs/>
+              </w:rPr>
+              <w:t>2</w:t>
+            </w:r>
+            <w:proofErr w:type="spellStart"/>
+            <w:r>
+              <w:rPr>
+                <w:rFonts w:ascii="TH Sarabun New" w:hAnsi="TH Sarabun New" w:cs="TH Sarabun New"/>
+                <w:sz w:val="20"/>
+                <w:szCs w:val="20"/>
+              </w:rPr>
+              <w:t>THNQdnJzcnRjBmFwcF</w:t>
+            </w:r>
+            <w:proofErr w:type="spellEnd"/>
+            <w:r>
+              <w:rPr>
+                <w:rFonts w:ascii="TH Sarabun New" w:hAnsi="TH Sarabun New" w:cs="TH Sarabun New"/>
+                <w:sz w:val="20"/>
+                <w:szCs w:val="20"/>
+                <w:cs/>
+              </w:rPr>
+              <w:t>9</w:t>
+            </w:r>
+            <w:proofErr w:type="spellStart"/>
+            <w:r>
+              <w:rPr>
+                <w:rFonts w:ascii="TH Sarabun New" w:hAnsi="TH Sarabun New" w:cs="TH Sarabun New"/>
+                <w:sz w:val="20"/>
+                <w:szCs w:val="20"/>
+              </w:rPr>
+              <w:t>pZBAyMjIwMzkxNzg</w:t>
+            </w:r>
+            <w:proofErr w:type="spellEnd"/>
+            <w:r>
+              <w:rPr>
+                <w:rFonts w:ascii="TH Sarabun New" w:hAnsi="TH Sarabun New" w:cs="TH Sarabun New"/>
+                <w:sz w:val="20"/>
+                <w:szCs w:val="20"/>
+                <w:cs/>
+              </w:rPr>
+              <w:t>4</w:t>
+            </w:r>
+            <w:proofErr w:type="spellStart"/>
+            <w:r>
+              <w:rPr>
+                <w:rFonts w:ascii="TH Sarabun New" w:hAnsi="TH Sarabun New" w:cs="TH Sarabun New"/>
+                <w:sz w:val="20"/>
+                <w:szCs w:val="20"/>
+              </w:rPr>
+              <w:t>MjAwODkyAAEeaW</w:t>
+            </w:r>
+            <w:proofErr w:type="spellEnd"/>
+            <w:r>
+              <w:rPr>
+                <w:rFonts w:ascii="TH Sarabun New" w:hAnsi="TH Sarabun New" w:cs="TH Sarabun New"/>
+                <w:sz w:val="20"/>
+                <w:szCs w:val="20"/>
+              </w:rPr>
+              <w:t>-Pe</w:t>
+            </w:r>
+            <w:r>
+              <w:rPr>
+                <w:rFonts w:ascii="TH Sarabun New" w:hAnsi="TH Sarabun New" w:cs="TH Sarabun New"/>
+                <w:sz w:val="20"/>
+                <w:szCs w:val="20"/>
+                <w:cs/>
+              </w:rPr>
+              <w:t>60</w:t>
+            </w:r>
+            <w:r>
+              <w:rPr>
+                <w:rFonts w:ascii="TH Sarabun New" w:hAnsi="TH Sarabun New" w:cs="TH Sarabun New"/>
+                <w:sz w:val="20"/>
+                <w:szCs w:val="20"/>
+              </w:rPr>
+              <w:t>a</w:t>
+            </w:r>
+            <w:r>
+              <w:rPr>
+                <w:rFonts w:ascii="TH Sarabun New" w:hAnsi="TH Sarabun New" w:cs="TH Sarabun New"/>
+                <w:sz w:val="20"/>
+                <w:szCs w:val="20"/>
+                <w:cs/>
+              </w:rPr>
+              <w:t>6</w:t>
+            </w:r>
+            <w:proofErr w:type="spellStart"/>
+            <w:r>
+              <w:rPr>
+                <w:rFonts w:ascii="TH Sarabun New" w:hAnsi="TH Sarabun New" w:cs="TH Sarabun New"/>
+                <w:sz w:val="20"/>
+                <w:szCs w:val="20"/>
+              </w:rPr>
+              <w:t>URlLejSDDfh</w:t>
+            </w:r>
+            <w:proofErr w:type="spellEnd"/>
+            <w:r>
+              <w:rPr>
+                <w:rFonts w:ascii="TH Sarabun New" w:hAnsi="TH Sarabun New" w:cs="TH Sarabun New"/>
+                <w:sz w:val="20"/>
+                <w:szCs w:val="20"/>
+                <w:cs/>
+              </w:rPr>
+              <w:t>2</w:t>
+            </w:r>
+            <w:r>
+              <w:rPr>
+                <w:rFonts w:ascii="TH Sarabun New" w:hAnsi="TH Sarabun New" w:cs="TH Sarabun New"/>
+                <w:sz w:val="20"/>
+                <w:szCs w:val="20"/>
+              </w:rPr>
+              <w:t>E</w:t>
+            </w:r>
+            <w:r>
+              <w:rPr>
+                <w:rFonts w:ascii="TH Sarabun New" w:hAnsi="TH Sarabun New" w:cs="TH Sarabun New"/>
+                <w:sz w:val="20"/>
+                <w:szCs w:val="20"/>
+                <w:cs/>
+              </w:rPr>
+              <w:t>33</w:t>
+            </w:r>
+            <w:proofErr w:type="spellStart"/>
+            <w:r>
+              <w:rPr>
+                <w:rFonts w:ascii="TH Sarabun New" w:hAnsi="TH Sarabun New" w:cs="TH Sarabun New"/>
+                <w:sz w:val="20"/>
+                <w:szCs w:val="20"/>
+              </w:rPr>
+              <w:t>cw</w:t>
+            </w:r>
+            <w:proofErr w:type="spellEnd"/>
+            <w:r>
+              <w:rPr>
+                <w:rFonts w:ascii="TH Sarabun New" w:hAnsi="TH Sarabun New" w:cs="TH Sarabun New"/>
+                <w:sz w:val="20"/>
+                <w:szCs w:val="20"/>
+                <w:cs/>
+              </w:rPr>
+              <w:t>8</w:t>
+            </w:r>
+            <w:proofErr w:type="spellStart"/>
+            <w:r>
+              <w:rPr>
+                <w:rFonts w:ascii="TH Sarabun New" w:hAnsi="TH Sarabun New" w:cs="TH Sarabun New"/>
+                <w:sz w:val="20"/>
+                <w:szCs w:val="20"/>
+              </w:rPr>
+              <w:t>nk</w:t>
+            </w:r>
+            <w:proofErr w:type="spellEnd"/>
+            <w:r>
+              <w:rPr>
+                <w:rFonts w:ascii="TH Sarabun New" w:hAnsi="TH Sarabun New" w:cs="TH Sarabun New"/>
+                <w:sz w:val="20"/>
+                <w:szCs w:val="20"/>
+                <w:cs/>
+              </w:rPr>
+              <w:t>17</w:t>
+            </w:r>
+            <w:r>
+              <w:rPr>
+                <w:rFonts w:ascii="TH Sarabun New" w:hAnsi="TH Sarabun New" w:cs="TH Sarabun New"/>
+                <w:sz w:val="20"/>
+                <w:szCs w:val="20"/>
+              </w:rPr>
+              <w:t>HS</w:t>
+            </w:r>
+            <w:r>
+              <w:rPr>
+                <w:rFonts w:ascii="TH Sarabun New" w:hAnsi="TH Sarabun New" w:cs="TH Sarabun New"/>
+                <w:sz w:val="20"/>
+                <w:szCs w:val="20"/>
+                <w:cs/>
+              </w:rPr>
+              <w:t>7</w:t>
+            </w:r>
+            <w:proofErr w:type="spellStart"/>
+            <w:r>
+              <w:rPr>
+                <w:rFonts w:ascii="TH Sarabun New" w:hAnsi="TH Sarabun New" w:cs="TH Sarabun New"/>
+                <w:sz w:val="20"/>
+                <w:szCs w:val="20"/>
+              </w:rPr>
+              <w:t>wLXs</w:t>
+            </w:r>
+            <w:proofErr w:type="spellEnd"/>
+            <w:r>
+              <w:rPr>
+                <w:rFonts w:ascii="TH Sarabun New" w:hAnsi="TH Sarabun New" w:cs="TH Sarabun New"/>
+                <w:sz w:val="20"/>
+                <w:szCs w:val="20"/>
+                <w:cs/>
+              </w:rPr>
+              <w:t>2</w:t>
+            </w:r>
+            <w:r>
+              <w:rPr>
+                <w:rFonts w:ascii="TH Sarabun New" w:hAnsi="TH Sarabun New" w:cs="TH Sarabun New"/>
+                <w:sz w:val="20"/>
+                <w:szCs w:val="20"/>
+              </w:rPr>
+              <w:t>f</w:t>
+            </w:r>
+            <w:r>
+              <w:rPr>
+                <w:rFonts w:ascii="TH Sarabun New" w:hAnsi="TH Sarabun New" w:cs="TH Sarabun New"/>
+                <w:sz w:val="20"/>
+                <w:szCs w:val="20"/>
+                <w:cs/>
+              </w:rPr>
+              <w:t>69</w:t>
+            </w:r>
+            <w:r>
+              <w:rPr>
+                <w:rFonts w:ascii="TH Sarabun New" w:hAnsi="TH Sarabun New" w:cs="TH Sarabun New"/>
+                <w:sz w:val="20"/>
+                <w:szCs w:val="20"/>
+              </w:rPr>
+              <w:t>v</w:t>
+            </w:r>
+            <w:r>
+              <w:rPr>
+                <w:rFonts w:ascii="TH Sarabun New" w:hAnsi="TH Sarabun New" w:cs="TH Sarabun New"/>
+                <w:sz w:val="20"/>
+                <w:szCs w:val="20"/>
+                <w:cs/>
+              </w:rPr>
+              <w:t>9</w:t>
+            </w:r>
+            <w:proofErr w:type="spellStart"/>
+            <w:r>
+              <w:rPr>
+                <w:rFonts w:ascii="TH Sarabun New" w:hAnsi="TH Sarabun New" w:cs="TH Sarabun New"/>
+                <w:sz w:val="20"/>
+                <w:szCs w:val="20"/>
+              </w:rPr>
+              <w:t>wK</w:t>
+            </w:r>
+            <w:proofErr w:type="spellEnd"/>
+            <w:r>
+              <w:rPr>
+                <w:rFonts w:ascii="TH Sarabun New" w:hAnsi="TH Sarabun New" w:cs="TH Sarabun New"/>
+                <w:sz w:val="20"/>
+                <w:szCs w:val="20"/>
+              </w:rPr>
+              <w:t>_</w:t>
+            </w:r>
+            <w:r>
+              <w:rPr>
+                <w:rFonts w:ascii="TH Sarabun New" w:hAnsi="TH Sarabun New" w:cs="TH Sarabun New"/>
+                <w:sz w:val="20"/>
+                <w:szCs w:val="20"/>
+                <w:cs/>
+              </w:rPr>
+              <w:t>6</w:t>
+            </w:r>
+            <w:proofErr w:type="spellStart"/>
+            <w:r>
+              <w:rPr>
+                <w:rFonts w:ascii="TH Sarabun New" w:hAnsi="TH Sarabun New" w:cs="TH Sarabun New"/>
+                <w:sz w:val="20"/>
+                <w:szCs w:val="20"/>
+              </w:rPr>
+              <w:t>wJPGJRpw</w:t>
+            </w:r>
+            <w:proofErr w:type="spellEnd"/>
+            <w:r>
+              <w:rPr>
+                <w:rFonts w:ascii="TH Sarabun New" w:hAnsi="TH Sarabun New" w:cs="TH Sarabun New"/>
+                <w:sz w:val="20"/>
+                <w:szCs w:val="20"/>
+                <w:cs/>
+              </w:rPr>
+              <w:t>4</w:t>
+            </w:r>
+            <w:proofErr w:type="spellStart"/>
+            <w:r>
+              <w:rPr>
+                <w:rFonts w:ascii="TH Sarabun New" w:hAnsi="TH Sarabun New" w:cs="TH Sarabun New"/>
+                <w:sz w:val="20"/>
+                <w:szCs w:val="20"/>
+              </w:rPr>
+              <w:t>So_aem_tHYwnty</w:t>
+            </w:r>
+            <w:proofErr w:type="spellEnd"/>
+            <w:r>
+              <w:rPr>
+                <w:rFonts w:ascii="TH Sarabun New" w:hAnsi="TH Sarabun New" w:cs="TH Sarabun New"/>
+                <w:sz w:val="20"/>
+                <w:szCs w:val="20"/>
+                <w:cs/>
+              </w:rPr>
+              <w:t>5</w:t>
+            </w:r>
+            <w:proofErr w:type="spellStart"/>
+            <w:r>
+              <w:rPr>
+                <w:rFonts w:ascii="TH Sarabun New" w:hAnsi="TH Sarabun New" w:cs="TH Sarabun New"/>
+                <w:sz w:val="20"/>
+                <w:szCs w:val="20"/>
+              </w:rPr>
+              <w:t>yYwkPhuKSPIIfA</w:t>
+            </w:r>
+            <w:proofErr w:type="spellEnd"/>
           </w:p>
         </w:tc>
       </w:tr>
@@ -2570,9 +3404,9 @@
         <w:tblLook w:val="04A0" w:firstRow="1" w:lastRow="0" w:firstColumn="1" w:lastColumn="0" w:noHBand="0" w:noVBand="1"/>
       </w:tblPr>
       <w:tblGrid>
-        <w:gridCol w:w="862"/>
+        <w:gridCol w:w="863"/>
         <w:gridCol w:w="5450"/>
-        <w:gridCol w:w="2413"/>
+        <w:gridCol w:w="2412"/>
       </w:tblGrid>
       <w:tr>
         <w:tc>
@@ -2677,7 +3511,6 @@
                 <w:szCs w:val="22"/>
                 <w:cs/>
               </w:rPr>
-              <w:lastRenderedPageBreak/>
               <w:t>1</w:t>
             </w:r>
           </w:p>
@@ -3257,6 +4090,7 @@
                 <w:szCs w:val="22"/>
                 <w:cs/>
               </w:rPr>
+              <w:lastRenderedPageBreak/>
               <w:t>4</w:t>
             </w:r>
           </w:p>
@@ -5298,7 +6132,6 @@
   <w:style w:type="character" w:default="1" w:styleId="DefaultParagraphFont">
     <w:name w:val="Default Paragraph Font"/>
     <w:uiPriority w:val="1"/>
-    <w:semiHidden/>
     <w:unhideWhenUsed/>
   </w:style>
   <w:style w:type="table" w:default="1" w:styleId="TableNormal">
@@ -5420,6 +6253,18 @@
     <w:rPr>
       <w:color w:val="0563C1" w:themeColor="hyperlink"/>
       <w:u w:val="single"/>
+    </w:rPr>
+  </w:style>
+  <w:style w:type="character" w:styleId="UnresolvedMention">
+    <w:name w:val="Unresolved Mention"/>
+    <w:basedOn w:val="DefaultParagraphFont"/>
+    <w:uiPriority w:val="99"/>
+    <w:semiHidden/>
+    <w:unhideWhenUsed/>
+    <w:rsid w:val="00940EA5"/>
+    <w:rPr>
+      <w:color w:val="605E5C"/>
+      <w:shd w:val="clear" w:color="auto" w:fill="E1DFDD"/>
     </w:rPr>
   </w:style>
 </w:styles>
@@ -5721,6 +6566,11 @@
 </file>
 
 <file path=customXml/item1.xml><?xml version="1.0" encoding="utf-8"?>
+<?mso-contentType ?>
+<SharedContentType xmlns="Microsoft.SharePoint.Taxonomy.ContentTypeSync" SourceId="5fc7acaa-f919-463b-ae62-f5f9386dcdd5" ContentTypeId="0x0101" PreviousValue="false" LastSyncTimeStamp="2021-07-23T15:19:22.11Z"/>
+</file>
+
+<file path=customXml/item2.xml><?xml version="1.0" encoding="utf-8"?>
 <ct:contentTypeSchema xmlns:ct="http://schemas.microsoft.com/office/2006/metadata/contentType" xmlns:ma="http://schemas.microsoft.com/office/2006/metadata/properties/metaAttributes" ct:_="" ma:_="" ma:contentTypeName="Document" ma:contentTypeID="0x01010093451F0884AC8E40AB423D2DE6E59F83" ma:contentTypeVersion="4" ma:contentTypeDescription="Create a new document." ma:contentTypeScope="" ma:versionID="7c878f5f637aeccb3b0d55e3e5e315f5">
   <xsd:schema xmlns:xsd="http://www.w3.org/2001/XMLSchema" xmlns:xs="http://www.w3.org/2001/XMLSchema" xmlns:p="http://schemas.microsoft.com/office/2006/metadata/properties" xmlns:ns2="a3e4397c-871b-4e7e-81c9-07ae46dbe50d" targetNamespace="http://schemas.microsoft.com/office/2006/metadata/properties" ma:root="true" ma:fieldsID="07c84e7ea2005fee5ed50317ca2b6c29" ns2:_="">
     <xsd:import namespace="a3e4397c-871b-4e7e-81c9-07ae46dbe50d"/>
@@ -5864,12 +6714,15 @@
 </ct:contentTypeSchema>
 </file>
 
-<file path=customXml/item2.xml><?xml version="1.0" encoding="utf-8"?>
-<?mso-contentType ?>
-<SharedContentType xmlns="Microsoft.SharePoint.Taxonomy.ContentTypeSync" SourceId="5fc7acaa-f919-463b-ae62-f5f9386dcdd5" ContentTypeId="0x0101" PreviousValue="false" LastSyncTimeStamp="2021-07-23T15:19:22.11Z"/>
+<file path=customXml/item3.xml><?xml version="1.0" encoding="utf-8"?>
+<p:properties xmlns:p="http://schemas.microsoft.com/office/2006/metadata/properties" xmlns:xsi="http://www.w3.org/2001/XMLSchema-instance" xmlns:pc="http://schemas.microsoft.com/office/infopath/2007/PartnerControls">
+  <documentManagement>
+    <ReferenceId xmlns="a3e4397c-871b-4e7e-81c9-07ae46dbe50d" xsi:nil="true"/>
+  </documentManagement>
+</p:properties>
 </file>
 
-<file path=customXml/item3.xml><?xml version="1.0" encoding="utf-8"?>
+<file path=customXml/item4.xml><?xml version="1.0" encoding="utf-8"?>
 <?mso-contentType ?>
 <FormTemplates xmlns="http://schemas.microsoft.com/sharepoint/v3/contenttype/forms">
   <Display>DocumentLibraryForm</Display>
@@ -5878,26 +6731,46 @@
 </FormTemplates>
 </file>
 
-<file path=customXml/item4.xml><?xml version="1.0" encoding="utf-8"?>
-<p:properties xmlns:p="http://schemas.microsoft.com/office/2006/metadata/properties" xmlns:xsi="http://www.w3.org/2001/XMLSchema-instance" xmlns:pc="http://schemas.microsoft.com/office/infopath/2007/PartnerControls">
-  <documentManagement>
-    <ReferenceId xmlns="a3e4397c-871b-4e7e-81c9-07ae46dbe50d" xsi:nil="true"/>
-  </documentManagement>
-</p:properties>
-</file>
-
 <file path=customXml/itemProps1.xml><?xml version="1.0" encoding="utf-8"?>
-<ds:datastoreItem xmlns:ds="http://schemas.openxmlformats.org/officeDocument/2006/customXml" ds:itemID="{5E67CD22-F92A-4980-9E92-BA56A0F8D9FB}"/>
+<ds:datastoreItem xmlns:ds="http://schemas.openxmlformats.org/officeDocument/2006/customXml" ds:itemID="{00ACB4FB-39FC-4D4A-B957-D319374A2FB9}">
+  <ds:schemaRefs>
+    <ds:schemaRef ds:uri="Microsoft.SharePoint.Taxonomy.ContentTypeSync"/>
+  </ds:schemaRefs>
+</ds:datastoreItem>
 </file>
 
 <file path=customXml/itemProps2.xml><?xml version="1.0" encoding="utf-8"?>
-<ds:datastoreItem xmlns:ds="http://schemas.openxmlformats.org/officeDocument/2006/customXml" ds:itemID="{00ACB4FB-39FC-4D4A-B957-D319374A2FB9}"/>
+<ds:datastoreItem xmlns:ds="http://schemas.openxmlformats.org/officeDocument/2006/customXml" ds:itemID="{5E67CD22-F92A-4980-9E92-BA56A0F8D9FB}">
+  <ds:schemaRefs>
+    <ds:schemaRef ds:uri="http://schemas.microsoft.com/office/2006/metadata/contentType"/>
+    <ds:schemaRef ds:uri="http://schemas.microsoft.com/office/2006/metadata/properties/metaAttributes"/>
+    <ds:schemaRef ds:uri="http://www.w3.org/2001/XMLSchema"/>
+    <ds:schemaRef ds:uri="http://schemas.microsoft.com/office/2006/metadata/properties"/>
+    <ds:schemaRef ds:uri="a3e4397c-871b-4e7e-81c9-07ae46dbe50d"/>
+    <ds:schemaRef ds:uri="http://schemas.microsoft.com/office/2006/documentManagement/types"/>
+    <ds:schemaRef ds:uri="http://schemas.microsoft.com/office/infopath/2007/PartnerControls"/>
+    <ds:schemaRef ds:uri="http://schemas.openxmlformats.org/package/2006/metadata/core-properties"/>
+    <ds:schemaRef ds:uri="http://purl.org/dc/elements/1.1/"/>
+    <ds:schemaRef ds:uri="http://purl.org/dc/terms/"/>
+    <ds:schemaRef ds:uri="http://schemas.microsoft.com/internal/obd"/>
+  </ds:schemaRefs>
+</ds:datastoreItem>
 </file>
 
 <file path=customXml/itemProps3.xml><?xml version="1.0" encoding="utf-8"?>
-<ds:datastoreItem xmlns:ds="http://schemas.openxmlformats.org/officeDocument/2006/customXml" ds:itemID="{A16FAAC2-1450-443C-914D-5C26252FF654}"/>
+<ds:datastoreItem xmlns:ds="http://schemas.openxmlformats.org/officeDocument/2006/customXml" ds:itemID="{34EADF0E-347A-49F8-B741-305ADDF0E2C4}">
+  <ds:schemaRefs>
+    <ds:schemaRef ds:uri="http://schemas.microsoft.com/office/2006/metadata/properties"/>
+    <ds:schemaRef ds:uri="http://schemas.microsoft.com/office/infopath/2007/PartnerControls"/>
+    <ds:schemaRef ds:uri="a3e4397c-871b-4e7e-81c9-07ae46dbe50d"/>
+  </ds:schemaRefs>
+</ds:datastoreItem>
 </file>
 
 <file path=customXml/itemProps4.xml><?xml version="1.0" encoding="utf-8"?>
-<ds:datastoreItem xmlns:ds="http://schemas.openxmlformats.org/officeDocument/2006/customXml" ds:itemID="{34EADF0E-347A-49F8-B741-305ADDF0E2C4}"/>
+<ds:datastoreItem xmlns:ds="http://schemas.openxmlformats.org/officeDocument/2006/customXml" ds:itemID="{A16FAAC2-1450-443C-914D-5C26252FF654}">
+  <ds:schemaRefs>
+    <ds:schemaRef ds:uri="http://schemas.microsoft.com/sharepoint/v3/contenttype/forms"/>
+  </ds:schemaRefs>
+</ds:datastoreItem>
 </file>
</xml_diff>